<commit_message>
feat: CE-2619 Add Comments to Assessments (#1690)
Co-authored-by: afwilcox <alecwilcox@gmail.com>
Co-authored-by: team-wolverine-nrm-repo-updater[bot] <203337993+team-wolverine-nrm-repo-updater[bot]@users.noreply.github.com>
</commit_message>
<xml_diff>
--- a/backend/templates/complaint/CDOGS-CEEB-COMPLAINT-TEMPLATE-v1.docx
+++ b/backend/templates/complaint/CDOGS-CEEB-COMPLAINT-TEMPLATE-v1.docx
@@ -7804,6 +7804,102 @@
           </w:p>
         </w:tc>
       </w:tr>
+      <w:tr>
+        <w:trPr>
+          <w:trHeight w:val="300"/>
+        </w:trPr>
+        <w:tc>
+          <w:tcPr>
+            <w:tcW w:w="5392" w:type="dxa"/>
+            <w:tcBorders>
+              <w:top w:val="nil"/>
+              <w:left w:val="nil"/>
+              <w:bottom w:val="nil"/>
+              <w:right w:val="single" w:color="7F7F7F" w:themeColor="text1" w:themeTint="80" w:sz="6"/>
+            </w:tcBorders>
+            <w:tcMar>
+              <w:left w:w="105" w:type="dxa"/>
+              <w:right w:w="105" w:type="dxa"/>
+            </w:tcMar>
+            <w:vAlign w:val="top"/>
+          </w:tcPr>
+          <w:p>
+            <w:pPr>
+              <w:spacing w:after="0"/>
+              <w:rPr>
+                <w:b w:val="0"/>
+                <w:bCs w:val="0"/>
+                <w:i w:val="0"/>
+                <w:iCs w:val="0"/>
+                <w:sz w:val="20"/>
+                <w:szCs w:val="20"/>
+              </w:rPr>
+            </w:pPr>
+            <w:r>
+              <w:rPr>
+                <w:b w:val="0"/>
+                <w:bCs w:val="0"/>
+                <w:i w:val="0"/>
+                <w:iCs w:val="0"/>
+                <w:sz w:val="20"/>
+                <w:szCs w:val="20"/>
+                <w:lang w:val="en-US"/>
+              </w:rPr>
+              <w:t>Comments</w:t>
+            </w:r>
+            <w:r>
+              <w:rPr>
+                <w:b w:val="1"/>
+                <w:bCs w:val="1"/>
+                <w:i w:val="0"/>
+                <w:iCs w:val="0"/>
+                <w:sz w:val="20"/>
+                <w:szCs w:val="20"/>
+                <w:lang w:val="en-CA"/>
+              </w:rPr>
+              <w:t> </w:t>
+            </w:r>
+          </w:p>
+        </w:tc>
+        <w:tc>
+          <w:tcPr>
+            <w:tcW w:w="5392" w:type="dxa"/>
+            <w:tcBorders>
+              <w:top w:val="nil"/>
+              <w:left w:val="single" w:color="7F7F7F" w:themeColor="text1" w:themeTint="80" w:sz="6"/>
+              <w:bottom w:val="nil"/>
+              <w:right w:val="nil"/>
+            </w:tcBorders>
+            <w:tcMar>
+              <w:left w:w="105" w:type="dxa"/>
+              <w:right w:w="105" w:type="dxa"/>
+            </w:tcMar>
+            <w:vAlign w:val="top"/>
+          </w:tcPr>
+          <w:p>
+            <w:pPr>
+              <w:spacing w:after="0"/>
+              <w:rPr>
+                <w:b w:val="0"/>
+                <w:bCs w:val="0"/>
+                <w:i w:val="0"/>
+                <w:iCs w:val="0"/>
+                <w:sz w:val="20"/>
+                <w:szCs w:val="20"/>
+              </w:rPr>
+            </w:pPr>
+            <w:r>
+              <w:rPr>
+                <w:rFonts w:ascii="BC Sans" w:hAnsi="BC Sans"/>
+                <w:sz w:val="20"/>
+                <w:szCs w:val="20"/>
+                <w:lang w:val="en-CA"/>
+              </w:rPr>
+              <w:t>{d.outcome.assessment[i].comments}</w:t>
+            </w:r>
+          </w:p>
+        </w:tc>
+      </w:tr>
     </w:tbl>
     <w:p>
       <w:pPr>
@@ -8403,6 +8499,104 @@
                 <w:lang w:val="en-CA"/>
               </w:rPr>
               <w:t>{d.outcome.assessment[i].assessmentDate}</w:t>
+            </w:r>
+          </w:p>
+        </w:tc>
+      </w:tr>
+      <w:tr>
+        <w:trPr>
+          <w:trHeight w:val="300"/>
+        </w:trPr>
+        <w:tc>
+          <w:tcPr>
+            <w:tcW w:w="5392" w:type="dxa"/>
+            <w:tcBorders>
+              <w:top w:val="nil"/>
+              <w:left w:val="nil"/>
+              <w:bottom w:val="nil"/>
+              <w:right w:val="single" w:color="7F7F7F" w:themeColor="text1" w:themeTint="80" w:sz="6"/>
+            </w:tcBorders>
+            <w:tcMar>
+              <w:left w:w="105" w:type="dxa"/>
+              <w:right w:w="105" w:type="dxa"/>
+            </w:tcMar>
+            <w:vAlign w:val="top"/>
+          </w:tcPr>
+          <w:p>
+            <w:pPr>
+              <w:bidi w:val="0"/>
+              <w:spacing w:after="0"/>
+              <w:rPr>
+                <w:b w:val="0"/>
+                <w:bCs w:val="0"/>
+                <w:i w:val="0"/>
+                <w:iCs w:val="0"/>
+                <w:sz w:val="20"/>
+                <w:szCs w:val="20"/>
+              </w:rPr>
+            </w:pPr>
+            <w:r>
+              <w:rPr>
+                <w:b w:val="0"/>
+                <w:bCs w:val="0"/>
+                <w:i w:val="0"/>
+                <w:iCs w:val="0"/>
+                <w:sz w:val="20"/>
+                <w:szCs w:val="20"/>
+                <w:lang w:val="en-US"/>
+              </w:rPr>
+              <w:t>Comments</w:t>
+            </w:r>
+            <w:r>
+              <w:rPr>
+                <w:b w:val="1"/>
+                <w:bCs w:val="1"/>
+                <w:i w:val="0"/>
+                <w:iCs w:val="0"/>
+                <w:sz w:val="20"/>
+                <w:szCs w:val="20"/>
+                <w:lang w:val="en-CA"/>
+              </w:rPr>
+              <w:t> </w:t>
+            </w:r>
+          </w:p>
+        </w:tc>
+        <w:tc>
+          <w:tcPr>
+            <w:tcW w:w="5392" w:type="dxa"/>
+            <w:tcBorders>
+              <w:top w:val="nil"/>
+              <w:left w:val="single" w:color="7F7F7F" w:themeColor="text1" w:themeTint="80" w:sz="6"/>
+              <w:bottom w:val="nil"/>
+              <w:right w:val="nil"/>
+            </w:tcBorders>
+            <w:tcMar>
+              <w:left w:w="105" w:type="dxa"/>
+              <w:right w:w="105" w:type="dxa"/>
+            </w:tcMar>
+            <w:vAlign w:val="top"/>
+          </w:tcPr>
+          <w:p>
+            <w:pPr>
+              <w:bidi w:val="0"/>
+              <w:spacing w:after="0"/>
+              <w:rPr>
+                <w:b w:val="0"/>
+                <w:bCs w:val="0"/>
+                <w:i w:val="0"/>
+                <w:iCs w:val="0"/>
+                <w:sz w:val="20"/>
+                <w:szCs w:val="20"/>
+              </w:rPr>
+            </w:pPr>
+            <w:r>
+              <w:rPr>
+                <w:rFonts w:ascii="BC Sans" w:hAnsi="BC Sans"/>
+                <w:sz w:val="20"/>
+                <w:szCs w:val="20"/>
+                <w:lang w:val="en-CA"/>
+              </w:rPr>
+              <w:t>{d.outcome.assessment[i].comments}</w:t>
             </w:r>
           </w:p>
         </w:tc>

</xml_diff>